<commit_message>
Edit file detskij-otdyh and delete file yandex_ver
</commit_message>
<xml_diff>
--- a/documents/dogovor_otdyh.docx
+++ b/documents/dogovor_otdyh.docx
@@ -1296,43 +1296,43 @@
           <w:szCs w:val="24"/>
           <w:lang w:eastAsia="en-US"/>
         </w:rPr>
+        <w:t>3.6. Образовательная программа, экскурсии</w:t>
+      </w:r>
+      <w:r>
+        <w:rPr>
+          <w:rFonts w:ascii="Times New Roman" w:hAnsi="Times New Roman" w:cs="Times New Roman"/>
+          <w:sz w:val="24"/>
+          <w:szCs w:val="24"/>
+          <w:lang w:eastAsia="en-US"/>
+        </w:rPr>
+        <w:t xml:space="preserve"> входят в стоимость пакета услуг</w:t>
+      </w:r>
+      <w:r>
+        <w:rPr>
+          <w:rFonts w:ascii="Times New Roman" w:hAnsi="Times New Roman" w:cs="Times New Roman"/>
+          <w:sz w:val="24"/>
+          <w:szCs w:val="24"/>
+          <w:lang w:eastAsia="en-US"/>
+        </w:rPr>
+        <w:t>.</w:t>
+      </w:r>
+    </w:p>
+    <w:p>
+      <w:pPr>
+        <w:pStyle w:val="a3"/>
+        <w:rPr>
+          <w:rFonts w:ascii="Times New Roman" w:hAnsi="Times New Roman" w:cs="Times New Roman"/>
+          <w:sz w:val="24"/>
+          <w:szCs w:val="24"/>
+        </w:rPr>
+      </w:pPr>
+      <w:r>
+        <w:rPr>
+          <w:rFonts w:ascii="Times New Roman" w:hAnsi="Times New Roman" w:cs="Times New Roman"/>
+          <w:sz w:val="24"/>
+          <w:szCs w:val="24"/>
+        </w:rPr>
         <w:lastRenderedPageBreak/>
-        <w:t>3.6. Образовательная программа, экскурсии</w:t>
-      </w:r>
-      <w:r>
-        <w:rPr>
-          <w:rFonts w:ascii="Times New Roman" w:hAnsi="Times New Roman" w:cs="Times New Roman"/>
-          <w:sz w:val="24"/>
-          <w:szCs w:val="24"/>
-          <w:lang w:eastAsia="en-US"/>
-        </w:rPr>
-        <w:t xml:space="preserve"> входят в стоимость пакета услуг</w:t>
-      </w:r>
-      <w:r>
-        <w:rPr>
-          <w:rFonts w:ascii="Times New Roman" w:hAnsi="Times New Roman" w:cs="Times New Roman"/>
-          <w:sz w:val="24"/>
-          <w:szCs w:val="24"/>
-          <w:lang w:eastAsia="en-US"/>
-        </w:rPr>
-        <w:t>.</w:t>
-      </w:r>
-    </w:p>
-    <w:p>
-      <w:pPr>
-        <w:pStyle w:val="a3"/>
-        <w:rPr>
-          <w:rFonts w:ascii="Times New Roman" w:hAnsi="Times New Roman" w:cs="Times New Roman"/>
-          <w:sz w:val="24"/>
-          <w:szCs w:val="24"/>
-        </w:rPr>
-      </w:pPr>
-      <w:r>
-        <w:rPr>
-          <w:rFonts w:ascii="Times New Roman" w:hAnsi="Times New Roman" w:cs="Times New Roman"/>
-          <w:sz w:val="24"/>
-          <w:szCs w:val="24"/>
-        </w:rPr>
         <w:t>3.7. Заказчик, являющийся физическим лицом (официальный представитель) направляет для обучения и отдыха своего ребёнка, в соответствии с условиями данного Договора.</w:t>
       </w:r>
     </w:p>
@@ -2285,7 +2285,6 @@
           <w:b/>
           <w:sz w:val="24"/>
         </w:rPr>
-        <w:lastRenderedPageBreak/>
         <w:t xml:space="preserve">4.3.  Заказчик обязан: </w:t>
       </w:r>
     </w:p>
@@ -2303,6 +2302,7 @@
           <w:rFonts w:ascii="Times New Roman" w:eastAsia="Times New Roman" w:hAnsi="Times New Roman" w:cs="Times New Roman"/>
           <w:sz w:val="24"/>
         </w:rPr>
+        <w:lastRenderedPageBreak/>
         <w:t xml:space="preserve">4.3.1. </w:t>
       </w:r>
       <w:r>
@@ -2709,15 +2709,7 @@
           <w:rFonts w:ascii="Times New Roman" w:hAnsi="Times New Roman" w:cs="Times New Roman"/>
           <w:sz w:val="24"/>
         </w:rPr>
-        <w:t xml:space="preserve">Возместить по требованию Исполнителя в полном объеме причиненные по вине Заказчика, вине лица, для которого приобретена Путевка, его законных представителей, убытки (вред), материальный ущерб, документально подтвержденные. Форма подтверждающего документа </w:t>
-      </w:r>
-      <w:r>
-        <w:rPr>
-          <w:rFonts w:ascii="Times New Roman" w:hAnsi="Times New Roman" w:cs="Times New Roman"/>
-          <w:sz w:val="24"/>
-        </w:rPr>
-        <w:lastRenderedPageBreak/>
-        <w:t>устанавливается Исполнителем. Сумма возмещения Определяется Исполнителем по рыночным ценам и принимается Заказчиком безоговорочно.</w:t>
+        <w:t>Возместить по требованию Исполнителя в полном объеме причиненные по вине Заказчика, вине лица, для которого приобретена Путевка, его законных представителей, убытки (вред), материальный ущерб, документально подтвержденные. Форма подтверждающего документа устанавливается Исполнителем. Сумма возмещения Определяется Исполнителем по рыночным ценам и принимается Заказчиком безоговорочно.</w:t>
       </w:r>
       <w:r>
         <w:rPr>
@@ -2743,6 +2735,7 @@
           <w:color w:val="auto"/>
           <w:sz w:val="24"/>
         </w:rPr>
+        <w:lastRenderedPageBreak/>
         <w:t xml:space="preserve">4.3.8.  При заезде предоставить Исполнителю следующие документы:  </w:t>
       </w:r>
     </w:p>
@@ -3276,7 +3269,6 @@
           <w:sz w:val="24"/>
           <w:szCs w:val="24"/>
         </w:rPr>
-        <w:lastRenderedPageBreak/>
         <w:t>6</w:t>
       </w:r>
       <w:r>
@@ -3306,6 +3298,7 @@
           <w:sz w:val="24"/>
           <w:szCs w:val="24"/>
         </w:rPr>
+        <w:lastRenderedPageBreak/>
         <w:t xml:space="preserve">6.1. Стоимость услуг определяется в соответствии с Прейскурантом, размещённом на страницах сайта Исполнителя по адресу: </w:t>
       </w:r>
       <w:hyperlink r:id="rId12" w:history="1">
@@ -3354,8 +3347,6 @@
         </w:rPr>
         <w:t>4</w:t>
       </w:r>
-      <w:bookmarkStart w:id="0" w:name="_GoBack"/>
-      <w:bookmarkEnd w:id="0"/>
       <w:r>
         <w:rPr>
           <w:rFonts w:ascii="Times New Roman" w:hAnsi="Times New Roman" w:cs="Times New Roman"/>
@@ -3784,63 +3775,63 @@
           <w:color w:val="auto"/>
           <w:sz w:val="24"/>
         </w:rPr>
+        <w:t>7.</w:t>
+      </w:r>
+      <w:r>
+        <w:rPr>
+          <w:rFonts w:ascii="Times New Roman" w:hAnsi="Times New Roman" w:cs="Times New Roman"/>
+          <w:color w:val="auto"/>
+          <w:sz w:val="24"/>
+        </w:rPr>
+        <w:t>4</w:t>
+      </w:r>
+      <w:r>
+        <w:rPr>
+          <w:rFonts w:ascii="Times New Roman" w:hAnsi="Times New Roman" w:cs="Times New Roman"/>
+          <w:color w:val="auto"/>
+          <w:sz w:val="24"/>
+        </w:rPr>
+        <w:t xml:space="preserve"> Заключением Договора Заказчик (законный представитель лица для которого приобретена </w:t>
+      </w:r>
+      <w:r>
+        <w:rPr>
+          <w:rFonts w:ascii="Times New Roman" w:hAnsi="Times New Roman" w:cs="Times New Roman"/>
+          <w:color w:val="auto"/>
+          <w:sz w:val="24"/>
+        </w:rPr>
+        <w:t>путевка) подтверждает,</w:t>
+      </w:r>
+      <w:r>
+        <w:rPr>
+          <w:rFonts w:ascii="Times New Roman" w:hAnsi="Times New Roman" w:cs="Times New Roman"/>
+          <w:color w:val="auto"/>
+          <w:sz w:val="24"/>
+        </w:rPr>
+        <w:t xml:space="preserve"> что лицо, для которого приобретена </w:t>
+      </w:r>
+      <w:r>
+        <w:rPr>
+          <w:rFonts w:ascii="Times New Roman" w:hAnsi="Times New Roman" w:cs="Times New Roman"/>
+          <w:color w:val="auto"/>
+          <w:sz w:val="24"/>
+        </w:rPr>
+        <w:t>Путевка,</w:t>
+      </w:r>
+      <w:r>
+        <w:rPr>
+          <w:rFonts w:ascii="Times New Roman" w:hAnsi="Times New Roman" w:cs="Times New Roman"/>
+          <w:color w:val="auto"/>
+          <w:sz w:val="24"/>
+        </w:rPr>
+        <w:t xml:space="preserve"> может участвовать во всех </w:t>
+      </w:r>
+      <w:r>
+        <w:rPr>
+          <w:rFonts w:ascii="Times New Roman" w:hAnsi="Times New Roman" w:cs="Times New Roman"/>
+          <w:color w:val="auto"/>
+          <w:sz w:val="24"/>
+        </w:rPr>
         <w:lastRenderedPageBreak/>
-        <w:t>7.</w:t>
-      </w:r>
-      <w:r>
-        <w:rPr>
-          <w:rFonts w:ascii="Times New Roman" w:hAnsi="Times New Roman" w:cs="Times New Roman"/>
-          <w:color w:val="auto"/>
-          <w:sz w:val="24"/>
-        </w:rPr>
-        <w:t>4</w:t>
-      </w:r>
-      <w:r>
-        <w:rPr>
-          <w:rFonts w:ascii="Times New Roman" w:hAnsi="Times New Roman" w:cs="Times New Roman"/>
-          <w:color w:val="auto"/>
-          <w:sz w:val="24"/>
-        </w:rPr>
-        <w:t xml:space="preserve"> Заключением Договора Заказчик (законный представитель лица для которого приобретена </w:t>
-      </w:r>
-      <w:r>
-        <w:rPr>
-          <w:rFonts w:ascii="Times New Roman" w:hAnsi="Times New Roman" w:cs="Times New Roman"/>
-          <w:color w:val="auto"/>
-          <w:sz w:val="24"/>
-        </w:rPr>
-        <w:t>путевка) подтверждает,</w:t>
-      </w:r>
-      <w:r>
-        <w:rPr>
-          <w:rFonts w:ascii="Times New Roman" w:hAnsi="Times New Roman" w:cs="Times New Roman"/>
-          <w:color w:val="auto"/>
-          <w:sz w:val="24"/>
-        </w:rPr>
-        <w:t xml:space="preserve"> что лицо, для которого приобретена </w:t>
-      </w:r>
-      <w:r>
-        <w:rPr>
-          <w:rFonts w:ascii="Times New Roman" w:hAnsi="Times New Roman" w:cs="Times New Roman"/>
-          <w:color w:val="auto"/>
-          <w:sz w:val="24"/>
-        </w:rPr>
-        <w:t>Путевка,</w:t>
-      </w:r>
-      <w:r>
-        <w:rPr>
-          <w:rFonts w:ascii="Times New Roman" w:hAnsi="Times New Roman" w:cs="Times New Roman"/>
-          <w:color w:val="auto"/>
-          <w:sz w:val="24"/>
-        </w:rPr>
-        <w:t xml:space="preserve"> может участвовать во всех </w:t>
-      </w:r>
-      <w:r>
-        <w:rPr>
-          <w:rFonts w:ascii="Times New Roman" w:hAnsi="Times New Roman" w:cs="Times New Roman"/>
-          <w:color w:val="auto"/>
-          <w:sz w:val="24"/>
-        </w:rPr>
         <w:t>активностях, развлекательных</w:t>
       </w:r>
       <w:r>
@@ -5644,7 +5635,13 @@
         <w:jc w:val="right"/>
       </w:pPr>
       <w:r>
-        <w:t xml:space="preserve">к публичному договору №01-2026 </w:t>
+        <w:t>к публичному договору №0</w:t>
+      </w:r>
+      <w:r>
+        <w:t>1</w:t>
+      </w:r>
+      <w:r>
+        <w:t xml:space="preserve">-2026 </w:t>
       </w:r>
     </w:p>
     <w:p>
@@ -5701,73 +5698,23 @@
     </w:p>
     <w:p>
       <w:pPr>
-        <w:keepNext/>
-        <w:keepLines/>
-        <w:spacing w:after="3"/>
-        <w:ind w:left="9" w:hanging="10"/>
-        <w:outlineLvl w:val="1"/>
-        <w:rPr>
-          <w:rFonts w:ascii="Times New Roman" w:eastAsia="Times New Roman" w:hAnsi="Times New Roman" w:cs="Times New Roman"/>
-          <w:b/>
-          <w:color w:val="2E74B5"/>
-          <w:sz w:val="24"/>
-        </w:rPr>
-      </w:pPr>
-      <w:r>
-        <w:rPr>
-          <w:rFonts w:ascii="Times New Roman" w:eastAsia="Times New Roman" w:hAnsi="Times New Roman" w:cs="Times New Roman"/>
-          <w:b/>
-          <w:color w:val="2E74B5"/>
-          <w:sz w:val="24"/>
-        </w:rPr>
-        <w:t>Смена 12 дней, 11 ночей</w:t>
-      </w:r>
-      <w:r>
-        <w:rPr>
-          <w:rFonts w:ascii="Times New Roman" w:eastAsia="Times New Roman" w:hAnsi="Times New Roman" w:cs="Times New Roman"/>
-          <w:color w:val="2E74B5"/>
-          <w:sz w:val="24"/>
-        </w:rPr>
-        <w:t xml:space="preserve"> </w:t>
-      </w:r>
-    </w:p>
-    <w:p>
-      <w:pPr>
         <w:spacing w:after="19"/>
         <w:ind w:left="14"/>
         <w:rPr>
           <w:rFonts w:ascii="Times New Roman" w:eastAsia="Times New Roman" w:hAnsi="Times New Roman" w:cs="Times New Roman"/>
-          <w:sz w:val="24"/>
-        </w:rPr>
-      </w:pPr>
-      <w:r>
-        <w:rPr>
-          <w:rFonts w:ascii="Times New Roman" w:eastAsia="Times New Roman" w:hAnsi="Times New Roman" w:cs="Times New Roman"/>
-          <w:sz w:val="24"/>
-        </w:rPr>
-        <w:t xml:space="preserve"> </w:t>
-      </w:r>
-    </w:p>
-    <w:p>
-      <w:pPr>
-        <w:numPr>
-          <w:ilvl w:val="0"/>
-          <w:numId w:val="24"/>
-        </w:numPr>
-        <w:spacing w:after="19"/>
-        <w:rPr>
-          <w:rFonts w:ascii="Times New Roman" w:hAnsi="Times New Roman" w:cs="Times New Roman"/>
-          <w:sz w:val="24"/>
-          <w:szCs w:val="24"/>
-        </w:rPr>
-      </w:pPr>
-      <w:r>
-        <w:rPr>
-          <w:rFonts w:ascii="Times New Roman" w:hAnsi="Times New Roman" w:cs="Times New Roman"/>
-          <w:sz w:val="24"/>
-          <w:szCs w:val="24"/>
-        </w:rPr>
-        <w:t>- 6-разовое питание</w:t>
+          <w:b/>
+          <w:color w:val="auto"/>
+          <w:sz w:val="24"/>
+        </w:rPr>
+      </w:pPr>
+      <w:r>
+        <w:rPr>
+          <w:rFonts w:ascii="Times New Roman" w:eastAsia="Times New Roman" w:hAnsi="Times New Roman" w:cs="Times New Roman"/>
+          <w:b/>
+          <w:color w:val="auto"/>
+          <w:sz w:val="24"/>
+        </w:rPr>
+        <w:t>Установить следующую стоимость на оказание услуг:</w:t>
       </w:r>
     </w:p>
     <w:p>
@@ -5775,43 +5722,12 @@
         <w:spacing w:after="19"/>
         <w:ind w:left="14"/>
         <w:rPr>
-          <w:rFonts w:ascii="Times New Roman" w:hAnsi="Times New Roman" w:cs="Times New Roman"/>
-          <w:sz w:val="24"/>
-          <w:szCs w:val="24"/>
-        </w:rPr>
-      </w:pPr>
-      <w:r>
-        <w:rPr>
-          <w:rFonts w:ascii="Times New Roman" w:hAnsi="Times New Roman" w:cs="Times New Roman"/>
-          <w:sz w:val="24"/>
-          <w:szCs w:val="24"/>
-        </w:rPr>
-        <w:pict>
-          <v:rect id="_x0000_i1025" style="width:247.5pt;height:0" o:hrpct="0" o:hralign="center" o:hrstd="t" o:hrnoshade="t" o:hr="t" fillcolor="#dfdada" stroked="f"/>
-        </w:pict>
-      </w:r>
-    </w:p>
-    <w:p>
-      <w:pPr>
-        <w:numPr>
-          <w:ilvl w:val="0"/>
-          <w:numId w:val="24"/>
-        </w:numPr>
-        <w:spacing w:after="19"/>
-        <w:rPr>
-          <w:rFonts w:ascii="Times New Roman" w:hAnsi="Times New Roman" w:cs="Times New Roman"/>
-          <w:sz w:val="24"/>
-          <w:szCs w:val="24"/>
-        </w:rPr>
-      </w:pPr>
-      <w:r>
-        <w:rPr>
-          <w:rFonts w:ascii="Times New Roman" w:hAnsi="Times New Roman" w:cs="Times New Roman"/>
-          <w:sz w:val="24"/>
-          <w:szCs w:val="24"/>
-        </w:rPr>
-        <w:t>- проживание</w:t>
-      </w:r>
+          <w:rFonts w:ascii="Times New Roman" w:eastAsia="Times New Roman" w:hAnsi="Times New Roman" w:cs="Times New Roman"/>
+          <w:b/>
+          <w:color w:val="auto"/>
+          <w:sz w:val="24"/>
+        </w:rPr>
+      </w:pPr>
     </w:p>
     <w:p>
       <w:pPr>
@@ -5819,42 +5735,9 @@
         <w:ind w:left="14"/>
         <w:rPr>
           <w:rFonts w:ascii="Times New Roman" w:hAnsi="Times New Roman" w:cs="Times New Roman"/>
-          <w:sz w:val="24"/>
-          <w:szCs w:val="24"/>
-        </w:rPr>
-      </w:pPr>
-      <w:r>
-        <w:rPr>
-          <w:rFonts w:ascii="Times New Roman" w:hAnsi="Times New Roman" w:cs="Times New Roman"/>
-          <w:sz w:val="24"/>
-          <w:szCs w:val="24"/>
-        </w:rPr>
-        <w:pict>
-          <v:rect id="_x0000_i1026" style="width:247.5pt;height:0" o:hrpct="0" o:hralign="center" o:hrstd="t" o:hrnoshade="t" o:hr="t" fillcolor="#dfdada" stroked="f"/>
-        </w:pict>
-      </w:r>
-    </w:p>
-    <w:p>
-      <w:pPr>
-        <w:numPr>
-          <w:ilvl w:val="0"/>
-          <w:numId w:val="24"/>
-        </w:numPr>
-        <w:spacing w:after="19"/>
-        <w:rPr>
-          <w:rFonts w:ascii="Times New Roman" w:hAnsi="Times New Roman" w:cs="Times New Roman"/>
-          <w:sz w:val="24"/>
-          <w:szCs w:val="24"/>
-        </w:rPr>
-      </w:pPr>
-      <w:r>
-        <w:rPr>
-          <w:rFonts w:ascii="Times New Roman" w:hAnsi="Times New Roman" w:cs="Times New Roman"/>
-          <w:sz w:val="24"/>
-          <w:szCs w:val="24"/>
-        </w:rPr>
-        <w:t>- оздоровительные процедуры</w:t>
-      </w:r>
+          <w:color w:val="auto"/>
+        </w:rPr>
+      </w:pPr>
     </w:p>
     <w:p>
       <w:pPr>
@@ -5862,291 +5745,14 @@
         <w:ind w:left="14"/>
         <w:rPr>
           <w:rFonts w:ascii="Times New Roman" w:hAnsi="Times New Roman" w:cs="Times New Roman"/>
-          <w:sz w:val="24"/>
-          <w:szCs w:val="24"/>
-        </w:rPr>
-      </w:pPr>
-    </w:p>
-    <w:p>
-      <w:pPr>
-        <w:numPr>
-          <w:ilvl w:val="0"/>
-          <w:numId w:val="24"/>
-        </w:numPr>
-        <w:spacing w:after="19"/>
-        <w:rPr>
-          <w:rFonts w:ascii="Times New Roman" w:hAnsi="Times New Roman" w:cs="Times New Roman"/>
-          <w:sz w:val="24"/>
-          <w:szCs w:val="24"/>
-        </w:rPr>
-      </w:pPr>
-      <w:r>
-        <w:rPr>
-          <w:rFonts w:ascii="Times New Roman" w:hAnsi="Times New Roman" w:cs="Times New Roman"/>
-          <w:sz w:val="24"/>
-          <w:szCs w:val="24"/>
-        </w:rPr>
-        <w:t>- трансфер</w:t>
-      </w:r>
-    </w:p>
-    <w:p>
-      <w:pPr>
-        <w:spacing w:after="19"/>
-        <w:ind w:left="14"/>
-        <w:rPr>
-          <w:rFonts w:ascii="Times New Roman" w:hAnsi="Times New Roman" w:cs="Times New Roman"/>
-          <w:sz w:val="24"/>
-          <w:szCs w:val="24"/>
-        </w:rPr>
-      </w:pPr>
-      <w:r>
-        <w:rPr>
-          <w:rFonts w:ascii="Times New Roman" w:hAnsi="Times New Roman" w:cs="Times New Roman"/>
-          <w:sz w:val="24"/>
-          <w:szCs w:val="24"/>
-        </w:rPr>
-        <w:pict>
-          <v:rect id="_x0000_i1027" style="width:247.5pt;height:0" o:hrpct="0" o:hralign="center" o:hrstd="t" o:hrnoshade="t" o:hr="t" fillcolor="#dfdada" stroked="f"/>
-        </w:pict>
-      </w:r>
-    </w:p>
-    <w:p>
-      <w:pPr>
-        <w:numPr>
-          <w:ilvl w:val="0"/>
-          <w:numId w:val="24"/>
-        </w:numPr>
-        <w:spacing w:after="19"/>
-        <w:rPr>
-          <w:rFonts w:ascii="Times New Roman" w:hAnsi="Times New Roman" w:cs="Times New Roman"/>
-          <w:sz w:val="24"/>
-          <w:szCs w:val="24"/>
-        </w:rPr>
-      </w:pPr>
-      <w:r>
-        <w:rPr>
-          <w:rFonts w:ascii="Times New Roman" w:hAnsi="Times New Roman" w:cs="Times New Roman"/>
-          <w:bCs/>
-          <w:sz w:val="24"/>
-          <w:szCs w:val="24"/>
-        </w:rPr>
-        <w:t>- дополнительные процедуры по назначению педиатра</w:t>
-      </w:r>
-    </w:p>
-    <w:p>
-      <w:pPr>
-        <w:spacing w:after="19"/>
-        <w:ind w:left="14"/>
-        <w:rPr>
-          <w:rFonts w:ascii="Times New Roman" w:hAnsi="Times New Roman" w:cs="Times New Roman"/>
-          <w:sz w:val="24"/>
-          <w:szCs w:val="24"/>
-        </w:rPr>
-      </w:pPr>
-      <w:r>
-        <w:rPr>
-          <w:rFonts w:ascii="Times New Roman" w:hAnsi="Times New Roman" w:cs="Times New Roman"/>
-          <w:sz w:val="24"/>
-          <w:szCs w:val="24"/>
-        </w:rPr>
-        <w:pict>
-          <v:rect id="_x0000_i1028" style="width:247.5pt;height:0" o:hrpct="0" o:hralign="center" o:hrstd="t" o:hrnoshade="t" o:hr="t" fillcolor="#dfdada" stroked="f"/>
-        </w:pict>
-      </w:r>
-    </w:p>
-    <w:p>
-      <w:pPr>
-        <w:numPr>
-          <w:ilvl w:val="0"/>
-          <w:numId w:val="24"/>
-        </w:numPr>
-        <w:spacing w:after="19"/>
-        <w:rPr>
-          <w:rFonts w:ascii="Times New Roman" w:hAnsi="Times New Roman" w:cs="Times New Roman"/>
-          <w:sz w:val="24"/>
-          <w:szCs w:val="24"/>
-        </w:rPr>
-      </w:pPr>
-      <w:r>
-        <w:rPr>
-          <w:rFonts w:ascii="Times New Roman" w:hAnsi="Times New Roman" w:cs="Times New Roman"/>
-          <w:bCs/>
-          <w:sz w:val="24"/>
-          <w:szCs w:val="24"/>
-        </w:rPr>
-        <w:t>- круглосуточная работа педагогов</w:t>
-      </w:r>
-    </w:p>
-    <w:p>
-      <w:pPr>
-        <w:spacing w:after="19"/>
-        <w:ind w:left="14"/>
-        <w:rPr>
-          <w:rFonts w:ascii="Times New Roman" w:hAnsi="Times New Roman" w:cs="Times New Roman"/>
-          <w:sz w:val="24"/>
-          <w:szCs w:val="24"/>
-        </w:rPr>
-      </w:pPr>
-      <w:r>
-        <w:rPr>
-          <w:rFonts w:ascii="Times New Roman" w:hAnsi="Times New Roman" w:cs="Times New Roman"/>
-          <w:sz w:val="24"/>
-          <w:szCs w:val="24"/>
-        </w:rPr>
-        <w:pict>
-          <v:rect id="_x0000_i1029" style="width:247.5pt;height:0" o:hrpct="0" o:hralign="center" o:hrstd="t" o:hrnoshade="t" o:hr="t" fillcolor="#dfdada" stroked="f"/>
-        </w:pict>
-      </w:r>
-    </w:p>
-    <w:p>
-      <w:pPr>
-        <w:numPr>
-          <w:ilvl w:val="0"/>
-          <w:numId w:val="24"/>
-        </w:numPr>
-        <w:spacing w:after="19"/>
-        <w:rPr>
-          <w:rFonts w:ascii="Times New Roman" w:hAnsi="Times New Roman" w:cs="Times New Roman"/>
-          <w:sz w:val="24"/>
-          <w:szCs w:val="24"/>
-        </w:rPr>
-      </w:pPr>
-      <w:r>
-        <w:rPr>
-          <w:rFonts w:ascii="Times New Roman" w:hAnsi="Times New Roman" w:cs="Times New Roman"/>
-          <w:bCs/>
-          <w:sz w:val="24"/>
-          <w:szCs w:val="24"/>
-        </w:rPr>
-        <w:t>- познавательно-развлекательная программа</w:t>
-      </w:r>
-    </w:p>
-    <w:p>
-      <w:pPr>
-        <w:spacing w:after="19"/>
-        <w:ind w:left="14"/>
-        <w:rPr>
-          <w:rFonts w:ascii="Times New Roman" w:hAnsi="Times New Roman" w:cs="Times New Roman"/>
-          <w:sz w:val="24"/>
-          <w:szCs w:val="24"/>
-        </w:rPr>
-      </w:pPr>
-      <w:r>
-        <w:rPr>
-          <w:rFonts w:ascii="Times New Roman" w:hAnsi="Times New Roman" w:cs="Times New Roman"/>
-          <w:sz w:val="24"/>
-          <w:szCs w:val="24"/>
-        </w:rPr>
-        <w:pict>
-          <v:rect id="_x0000_i1030" style="width:247.5pt;height:0" o:hrpct="0" o:hralign="center" o:hrstd="t" o:hrnoshade="t" o:hr="t" fillcolor="#dfdada" stroked="f"/>
-        </w:pict>
-      </w:r>
-    </w:p>
-    <w:p>
-      <w:pPr>
-        <w:numPr>
-          <w:ilvl w:val="0"/>
-          <w:numId w:val="24"/>
-        </w:numPr>
-        <w:spacing w:after="19"/>
-        <w:rPr>
-          <w:rFonts w:ascii="Times New Roman" w:hAnsi="Times New Roman" w:cs="Times New Roman"/>
-          <w:sz w:val="24"/>
-          <w:szCs w:val="24"/>
-        </w:rPr>
-      </w:pPr>
-      <w:r>
-        <w:rPr>
-          <w:rFonts w:ascii="Times New Roman" w:hAnsi="Times New Roman" w:cs="Times New Roman"/>
-          <w:bCs/>
-          <w:sz w:val="24"/>
-          <w:szCs w:val="24"/>
-        </w:rPr>
-        <w:t>- английский язык</w:t>
-      </w:r>
-    </w:p>
-    <w:p>
-      <w:pPr>
-        <w:spacing w:after="19"/>
-        <w:ind w:left="14"/>
-        <w:rPr>
-          <w:rFonts w:ascii="Times New Roman" w:hAnsi="Times New Roman" w:cs="Times New Roman"/>
-          <w:sz w:val="24"/>
-          <w:szCs w:val="24"/>
-        </w:rPr>
-      </w:pPr>
-      <w:r>
-        <w:rPr>
-          <w:rFonts w:ascii="Times New Roman" w:hAnsi="Times New Roman" w:cs="Times New Roman"/>
-          <w:sz w:val="24"/>
-          <w:szCs w:val="24"/>
-        </w:rPr>
-        <w:pict>
-          <v:rect id="_x0000_i1031" style="width:247.5pt;height:0" o:hrpct="0" o:hralign="center" o:hrstd="t" o:hrnoshade="t" o:hr="t" fillcolor="#dfdada" stroked="f"/>
-        </w:pict>
-      </w:r>
-    </w:p>
-    <w:p>
-      <w:pPr>
-        <w:numPr>
-          <w:ilvl w:val="0"/>
-          <w:numId w:val="24"/>
-        </w:numPr>
-        <w:spacing w:after="19"/>
-        <w:rPr>
-          <w:rFonts w:ascii="Times New Roman" w:hAnsi="Times New Roman" w:cs="Times New Roman"/>
-          <w:sz w:val="24"/>
-          <w:szCs w:val="24"/>
-        </w:rPr>
-      </w:pPr>
-      <w:r>
-        <w:rPr>
-          <w:rFonts w:ascii="Times New Roman" w:hAnsi="Times New Roman" w:cs="Times New Roman"/>
-          <w:bCs/>
-          <w:sz w:val="24"/>
-          <w:szCs w:val="24"/>
-        </w:rPr>
-        <w:t>- экскурсии</w:t>
-      </w:r>
-    </w:p>
-    <w:p>
-      <w:pPr>
-        <w:spacing w:after="19"/>
-        <w:ind w:left="14"/>
-      </w:pPr>
-    </w:p>
-    <w:p>
-      <w:pPr>
-        <w:numPr>
-          <w:ilvl w:val="0"/>
-          <w:numId w:val="24"/>
-        </w:numPr>
-        <w:spacing w:after="19"/>
-        <w:rPr>
-          <w:rFonts w:ascii="Times New Roman" w:hAnsi="Times New Roman" w:cs="Times New Roman"/>
-        </w:rPr>
-      </w:pPr>
-      <w:r>
-        <w:rPr>
-          <w:rFonts w:ascii="Times New Roman" w:hAnsi="Times New Roman" w:cs="Times New Roman"/>
-          <w:b/>
-          <w:bCs/>
-        </w:rPr>
-        <w:t>1300 рублей</w:t>
-      </w:r>
-      <w:r>
-        <w:rPr>
-          <w:rFonts w:ascii="Times New Roman" w:hAnsi="Times New Roman" w:cs="Times New Roman"/>
-        </w:rPr>
-        <w:t xml:space="preserve"> - </w:t>
-      </w:r>
-      <w:r>
-        <w:rPr>
-          <w:rFonts w:ascii="Times New Roman" w:hAnsi="Times New Roman" w:cs="Times New Roman"/>
-          <w:b/>
+        </w:rPr>
+      </w:pPr>
+      <w:r>
+        <w:rPr>
+          <w:rFonts w:ascii="Times New Roman" w:hAnsi="Times New Roman" w:cs="Times New Roman"/>
           <w:color w:val="FF0000"/>
         </w:rPr>
-        <w:t>бронирование до </w:t>
+        <w:t xml:space="preserve">- 1 смена. </w:t>
       </w:r>
       <w:r>
         <w:rPr>
@@ -6155,52 +5761,7 @@
           <w:bCs/>
           <w:color w:val="FF0000"/>
         </w:rPr>
-        <w:t>15 апреля 2026г.</w:t>
-      </w:r>
-    </w:p>
-    <w:p>
-      <w:pPr>
-        <w:spacing w:after="19"/>
-        <w:ind w:left="14"/>
-        <w:rPr>
-          <w:rFonts w:ascii="Times New Roman" w:hAnsi="Times New Roman" w:cs="Times New Roman"/>
-        </w:rPr>
-      </w:pPr>
-    </w:p>
-    <w:p>
-      <w:pPr>
-        <w:numPr>
-          <w:ilvl w:val="0"/>
-          <w:numId w:val="24"/>
-        </w:numPr>
-        <w:spacing w:after="19"/>
-        <w:rPr>
-          <w:rFonts w:ascii="Times New Roman" w:hAnsi="Times New Roman" w:cs="Times New Roman"/>
-        </w:rPr>
-      </w:pPr>
-      <w:r>
-        <w:rPr>
-          <w:rFonts w:ascii="Times New Roman" w:hAnsi="Times New Roman" w:cs="Times New Roman"/>
-          <w:b/>
-          <w:bCs/>
-        </w:rPr>
-        <w:t>1400 рублей</w:t>
-      </w:r>
-      <w:r>
-        <w:rPr>
-          <w:rFonts w:ascii="Times New Roman" w:hAnsi="Times New Roman" w:cs="Times New Roman"/>
-        </w:rPr>
-        <w:t xml:space="preserve"> - </w:t>
-      </w:r>
-      <w:r>
-        <w:rPr>
-          <w:rFonts w:ascii="Times New Roman" w:hAnsi="Times New Roman" w:cs="Times New Roman"/>
-          <w:b/>
-          <w:color w:val="FF0000"/>
-          <w:sz w:val="24"/>
-          <w:szCs w:val="24"/>
-        </w:rPr>
-        <w:t>бронирование до </w:t>
+        <w:t xml:space="preserve"> Стоимость - 13</w:t>
       </w:r>
       <w:r>
         <w:rPr>
@@ -6208,63 +5769,8 @@
           <w:b/>
           <w:bCs/>
           <w:color w:val="FF0000"/>
-          <w:sz w:val="24"/>
-          <w:szCs w:val="24"/>
-        </w:rPr>
-        <w:t>15 мая 2026г.</w:t>
-      </w:r>
-    </w:p>
-    <w:p>
-      <w:pPr>
-        <w:spacing w:after="19"/>
-        <w:ind w:left="14"/>
-        <w:rPr>
-          <w:rFonts w:ascii="Times New Roman" w:hAnsi="Times New Roman" w:cs="Times New Roman"/>
-        </w:rPr>
-      </w:pPr>
-      <w:r>
-        <w:rPr>
-          <w:rFonts w:ascii="Times New Roman" w:hAnsi="Times New Roman" w:cs="Times New Roman"/>
-        </w:rPr>
-        <w:pict>
-          <v:rect id="_x0000_i1032" style="width:247.5pt;height:0" o:hrpct="0" o:hralign="center" o:hrstd="t" o:hrnoshade="t" o:hr="t" fillcolor="#dfdada" stroked="f"/>
-        </w:pict>
-      </w:r>
-    </w:p>
-    <w:p>
-      <w:pPr>
-        <w:numPr>
-          <w:ilvl w:val="0"/>
-          <w:numId w:val="24"/>
-        </w:numPr>
-        <w:spacing w:after="19"/>
-        <w:rPr>
-          <w:rFonts w:ascii="Times New Roman" w:hAnsi="Times New Roman" w:cs="Times New Roman"/>
-        </w:rPr>
-      </w:pPr>
-      <w:r>
-        <w:rPr>
-          <w:rFonts w:ascii="Times New Roman" w:hAnsi="Times New Roman" w:cs="Times New Roman"/>
-          <w:b/>
-          <w:bCs/>
-        </w:rPr>
-        <w:t>1600 рублей</w:t>
-      </w:r>
-      <w:r>
-        <w:rPr>
-          <w:rFonts w:ascii="Times New Roman" w:hAnsi="Times New Roman" w:cs="Times New Roman"/>
-        </w:rPr>
-        <w:t xml:space="preserve"> - </w:t>
-      </w:r>
-      <w:r>
-        <w:rPr>
-          <w:rFonts w:ascii="Times New Roman" w:hAnsi="Times New Roman" w:cs="Times New Roman"/>
-          <w:b/>
-          <w:color w:val="FF0000"/>
-          <w:sz w:val="24"/>
-          <w:szCs w:val="24"/>
-        </w:rPr>
-        <w:t>бронирование после </w:t>
+        </w:rPr>
+        <w:t>8</w:t>
       </w:r>
       <w:r>
         <w:rPr>
@@ -6272,11 +5778,155 @@
           <w:b/>
           <w:bCs/>
           <w:color w:val="FF0000"/>
-          <w:sz w:val="24"/>
-          <w:szCs w:val="24"/>
-        </w:rPr>
-        <w:t>15 мая 2026г.</w:t>
-      </w:r>
+        </w:rPr>
+        <w:t>0 рублей.</w:t>
+      </w:r>
+    </w:p>
+    <w:p>
+      <w:pPr>
+        <w:spacing w:after="19"/>
+        <w:ind w:left="14"/>
+        <w:rPr>
+          <w:rFonts w:ascii="Times New Roman" w:hAnsi="Times New Roman" w:cs="Times New Roman"/>
+          <w:b/>
+          <w:bCs/>
+          <w:color w:val="FF0000"/>
+        </w:rPr>
+      </w:pPr>
+      <w:r>
+        <w:rPr>
+          <w:rFonts w:ascii="Times New Roman" w:hAnsi="Times New Roman" w:cs="Times New Roman"/>
+          <w:color w:val="FF0000"/>
+        </w:rPr>
+        <w:t xml:space="preserve"> - 2 смена.</w:t>
+      </w:r>
+      <w:r>
+        <w:rPr>
+          <w:rFonts w:ascii="Times New Roman" w:hAnsi="Times New Roman" w:cs="Times New Roman"/>
+          <w:b/>
+          <w:bCs/>
+          <w:color w:val="FF0000"/>
+          <w:sz w:val="24"/>
+          <w:szCs w:val="24"/>
+        </w:rPr>
+        <w:t xml:space="preserve">  </w:t>
+      </w:r>
+      <w:r>
+        <w:rPr>
+          <w:rFonts w:ascii="Times New Roman" w:hAnsi="Times New Roman" w:cs="Times New Roman"/>
+          <w:b/>
+          <w:bCs/>
+          <w:color w:val="FF0000"/>
+        </w:rPr>
+        <w:t>Стоимость - 1</w:t>
+      </w:r>
+      <w:r>
+        <w:rPr>
+          <w:rFonts w:ascii="Times New Roman" w:hAnsi="Times New Roman" w:cs="Times New Roman"/>
+          <w:b/>
+          <w:bCs/>
+          <w:color w:val="FF0000"/>
+        </w:rPr>
+        <w:t>4</w:t>
+      </w:r>
+      <w:r>
+        <w:rPr>
+          <w:rFonts w:ascii="Times New Roman" w:hAnsi="Times New Roman" w:cs="Times New Roman"/>
+          <w:b/>
+          <w:bCs/>
+          <w:color w:val="FF0000"/>
+        </w:rPr>
+        <w:t>2</w:t>
+      </w:r>
+      <w:r>
+        <w:rPr>
+          <w:rFonts w:ascii="Times New Roman" w:hAnsi="Times New Roman" w:cs="Times New Roman"/>
+          <w:b/>
+          <w:bCs/>
+          <w:color w:val="FF0000"/>
+        </w:rPr>
+        <w:t>0</w:t>
+      </w:r>
+      <w:r>
+        <w:rPr>
+          <w:rFonts w:ascii="Times New Roman" w:hAnsi="Times New Roman" w:cs="Times New Roman"/>
+          <w:b/>
+          <w:bCs/>
+          <w:color w:val="FF0000"/>
+        </w:rPr>
+        <w:t xml:space="preserve"> рублей.</w:t>
+      </w:r>
+    </w:p>
+    <w:p>
+      <w:pPr>
+        <w:spacing w:after="19"/>
+        <w:ind w:left="14"/>
+        <w:rPr>
+          <w:rFonts w:ascii="Times New Roman" w:hAnsi="Times New Roman" w:cs="Times New Roman"/>
+          <w:color w:val="FF0000"/>
+        </w:rPr>
+      </w:pPr>
+      <w:r>
+        <w:rPr>
+          <w:rFonts w:ascii="Times New Roman" w:hAnsi="Times New Roman" w:cs="Times New Roman"/>
+          <w:color w:val="FF0000"/>
+        </w:rPr>
+        <w:t xml:space="preserve"> -</w:t>
+      </w:r>
+      <w:r>
+        <w:rPr>
+          <w:rFonts w:ascii="Times New Roman" w:hAnsi="Times New Roman" w:cs="Times New Roman"/>
+          <w:color w:val="FF0000"/>
+        </w:rPr>
+        <w:t xml:space="preserve"> 3 смена.  </w:t>
+      </w:r>
+      <w:r>
+        <w:rPr>
+          <w:rFonts w:ascii="Times New Roman" w:hAnsi="Times New Roman" w:cs="Times New Roman"/>
+          <w:b/>
+          <w:bCs/>
+          <w:color w:val="FF0000"/>
+        </w:rPr>
+        <w:t>Стоимость - 14</w:t>
+      </w:r>
+      <w:r>
+        <w:rPr>
+          <w:rFonts w:ascii="Times New Roman" w:hAnsi="Times New Roman" w:cs="Times New Roman"/>
+          <w:b/>
+          <w:bCs/>
+          <w:color w:val="FF0000"/>
+        </w:rPr>
+        <w:t>0</w:t>
+      </w:r>
+      <w:r>
+        <w:rPr>
+          <w:rFonts w:ascii="Times New Roman" w:hAnsi="Times New Roman" w:cs="Times New Roman"/>
+          <w:b/>
+          <w:bCs/>
+          <w:color w:val="FF0000"/>
+        </w:rPr>
+        <w:t>0 рублей.</w:t>
+      </w:r>
+    </w:p>
+    <w:p>
+      <w:pPr>
+        <w:spacing w:after="19"/>
+        <w:ind w:left="720"/>
+        <w:rPr>
+          <w:rFonts w:ascii="Times New Roman" w:hAnsi="Times New Roman" w:cs="Times New Roman"/>
+        </w:rPr>
+      </w:pPr>
+      <w:bookmarkStart w:id="0" w:name="_GoBack"/>
+      <w:bookmarkEnd w:id="0"/>
+    </w:p>
+    <w:p>
+      <w:pPr>
+        <w:spacing w:after="19"/>
+        <w:ind w:left="14"/>
+        <w:rPr>
+          <w:rFonts w:ascii="Times New Roman" w:hAnsi="Times New Roman" w:cs="Times New Roman"/>
+        </w:rPr>
+      </w:pPr>
     </w:p>
     <w:p>
       <w:pPr>

</xml_diff>